<commit_message>
docs: Aktualisiere Anwender- und Benutzerdokumentation mit juengsten Funktionen
</commit_message>
<xml_diff>
--- a/docs/Anwenderdokumentation.docx
+++ b/docs/Anwenderdokumentation.docx
@@ -28,7 +28,7 @@
         <w:t>Dokumentstand:</w:t>
       </w:r>
       <w:r>
-        <w:t xml:space="preserve"> 29. Juli 2026</w:t>
+        <w:t xml:space="preserve"> 1. Oktober 2026</w:t>
       </w:r>
     </w:p>
     <w:p>
@@ -288,6 +288,14 @@
       </w:r>
     </w:p>
     <w:p>
+      <w:pPr>
+        <w:pStyle w:val="ListNumber"/>
+      </w:pPr>
+      <w:r>
+        <w:t>Änderungen / Versionshinweise</w:t>
+      </w:r>
+    </w:p>
+    <w:p>
       <w:r>
         <w:br w:type="page"/>
       </w:r>
@@ -383,6 +391,236 @@
       </w:pPr>
       <w:r>
         <w:t>einen vollständigen Arbeitsstand oder ein Änderungspaket exportieren.</w:t>
+      </w:r>
+    </w:p>
+    <w:p>
+      <w:pPr>
+        <w:pStyle w:val="Heading3"/>
+      </w:pPr>
+      <w:r>
+        <w:t>Empfohlener Einsatz vor Creo: Komponenten umsortieren und bereinigen</w:t>
+      </w:r>
+    </w:p>
+    <w:p>
+      <w:r>
+        <w:t xml:space="preserve">Der </w:t>
+      </w:r>
+      <w:r>
+        <w:t>Advanced 3D IDX Viewer</w:t>
+      </w:r>
+      <w:r>
+        <w:t xml:space="preserve"> kann verwendet werden, um eine IDX-Datei bereits</w:t>
+      </w:r>
+    </w:p>
+    <w:p>
+      <w:r>
+        <w:t>vor dem Import in Creo aufzubereiten. Besonders geeignet ist er für:</w:t>
+      </w:r>
+    </w:p>
+    <w:p>
+      <w:pPr>
+        <w:pStyle w:val="ListBullet"/>
+      </w:pPr>
+      <w:r>
+        <w:t>das ergonomische Umsortieren von Komponenten per Drag-and-drop oder über die Reihenfolge-Schaltflächen,</w:t>
+      </w:r>
+    </w:p>
+    <w:p>
+      <w:pPr>
+        <w:pStyle w:val="ListBullet"/>
+      </w:pPr>
+      <w:r>
+        <w:t>das schnelle Suchen und gleichzeitige Auswählen mehrerer Komponenten,</w:t>
+      </w:r>
+    </w:p>
+    <w:p>
+      <w:pPr>
+        <w:pStyle w:val="ListBullet"/>
+      </w:pPr>
+      <w:r>
+        <w:t>das Entfernen nicht benötigter Komponenten über den Papierkorb,</w:t>
+      </w:r>
+    </w:p>
+    <w:p>
+      <w:pPr>
+        <w:pStyle w:val="ListBullet"/>
+      </w:pPr>
+      <w:r>
+        <w:t>die visuelle Kontrolle des bereinigten Ergebnisses vor der Übergabe an Creo.</w:t>
+      </w:r>
+    </w:p>
+    <w:p>
+      <w:r>
+        <w:t>Der browserbasierte Viewer ist für diese Arbeiten in der Regel schneller und ergonomischer als eine nachträgliche</w:t>
+      </w:r>
+    </w:p>
+    <w:p>
+      <w:r>
+        <w:t>Bereinigung im Creo-Modellbaum. Creo muss dafür nicht gestartet werden. Deshalb wird für das Umsortieren, Prüfen und</w:t>
+      </w:r>
+    </w:p>
+    <w:p>
+      <w:r>
+        <w:t>Bereinigen im Viewer keine zusätzliche Creo-ECAD/IDX-Lizenz benötigt. Eine gegebenenfalls für den späteren Import</w:t>
+      </w:r>
+    </w:p>
+    <w:p>
+      <w:r>
+        <w:t>oder weitere ECAD-Funktionen in Creo erforderliche Lizenz ist davon unabhängig.</w:t>
+      </w:r>
+    </w:p>
+    <w:p>
+      <w:r>
+        <w:t>Empfohlener Ablauf:</w:t>
+      </w:r>
+    </w:p>
+    <w:p>
+      <w:pPr>
+        <w:pStyle w:val="ListNumber"/>
+      </w:pPr>
+      <w:r>
+        <w:t>IDX-Baseline im Viewer laden.</w:t>
+      </w:r>
+    </w:p>
+    <w:p>
+      <w:pPr>
+        <w:pStyle w:val="ListNumber"/>
+      </w:pPr>
+      <w:r>
+        <w:t>Nicht benötigte Komponenten über Suche und Mehrfachauswahl ermitteln.</w:t>
+      </w:r>
+    </w:p>
+    <w:p>
+      <w:pPr>
+        <w:pStyle w:val="ListNumber"/>
+      </w:pPr>
+      <w:r>
+        <w:t xml:space="preserve">Komponenten per Drag-and-drop oder mit </w:t>
+      </w:r>
+      <w:r>
+        <w:rPr>
+          <w:b/>
+        </w:rPr>
+        <w:t>Ganz nach oben</w:t>
+      </w:r>
+      <w:r>
+        <w:t xml:space="preserve"> beziehungsweise </w:t>
+      </w:r>
+      <w:r>
+        <w:rPr>
+          <w:b/>
+        </w:rPr>
+        <w:t>Ganz nach unten</w:t>
+      </w:r>
+      <w:r>
+        <w:t xml:space="preserve"> umsortieren.</w:t>
+      </w:r>
+    </w:p>
+    <w:p>
+      <w:pPr>
+        <w:pStyle w:val="ListNumber"/>
+      </w:pPr>
+      <w:r>
+        <w:t>Zu entfernende Komponenten mit dem Papierkorb markieren.</w:t>
+      </w:r>
+    </w:p>
+    <w:p>
+      <w:pPr>
+        <w:pStyle w:val="ListNumber"/>
+      </w:pPr>
+      <w:r>
+        <w:t xml:space="preserve">Das Ergebnis im 3D-Modell und unter </w:t>
+      </w:r>
+      <w:r>
+        <w:rPr>
+          <w:b/>
+        </w:rPr>
+        <w:t>Aktuelle manuelle Änderungen</w:t>
+      </w:r>
+      <w:r>
+        <w:t xml:space="preserve"> kontrollieren.</w:t>
+      </w:r>
+    </w:p>
+    <w:p>
+      <w:pPr>
+        <w:pStyle w:val="ListNumber"/>
+      </w:pPr>
+      <w:r>
+        <w:t xml:space="preserve">Die Option </w:t>
+      </w:r>
+      <w:r>
+        <w:rPr>
+          <w:b/>
+        </w:rPr>
+        <w:t>IDs neu nummerieren (Reihenfolge für Creo)</w:t>
+      </w:r>
+      <w:r>
+        <w:t xml:space="preserve"> kontrollieren (standardmäßig eingeschaltet), damit Creo die</w:t>
+      </w:r>
+    </w:p>
+    <w:p>
+      <w:r>
+        <w:t xml:space="preserve">   Komponenten in der im Modellbaum eingestellten Reihenfolge anzeigt (siehe Abschnitt 15.1).</w:t>
+      </w:r>
+    </w:p>
+    <w:p>
+      <w:pPr>
+        <w:pStyle w:val="ListNumber"/>
+      </w:pPr>
+      <w:r>
+        <w:t xml:space="preserve">Den bereinigten Stand über </w:t>
+      </w:r>
+      <w:r>
+        <w:rPr>
+          <w:b/>
+        </w:rPr>
+        <w:t>Export</w:t>
+      </w:r>
+      <w:r>
+        <w:t xml:space="preserve"> als neue </w:t>
+      </w:r>
+      <w:r>
+        <w:rPr>
+          <w:rFonts w:ascii="Consolas" w:hAnsi="Consolas"/>
+          <w:color w:val="5C3815"/>
+          <w:sz w:val="19"/>
+        </w:rPr>
+        <w:t>_filtered.idx</w:t>
+      </w:r>
+      <w:r>
+        <w:t>-Datei speichern.</w:t>
+      </w:r>
+    </w:p>
+    <w:p>
+      <w:pPr>
+        <w:pStyle w:val="ListNumber"/>
+      </w:pPr>
+      <w:r>
+        <w:t>Die exportierte Datei anschließend in Creo weiterverwenden.</w:t>
+      </w:r>
+    </w:p>
+    <w:p>
+      <w:r>
+        <w:t xml:space="preserve">&gt; </w:t>
+      </w:r>
+      <w:r>
+        <w:rPr>
+          <w:b/>
+        </w:rPr>
+        <w:t>Wichtig:</w:t>
+      </w:r>
+      <w:r>
+        <w:t xml:space="preserve"> Das Auge blendet Komponenten nur aus. Nur der Papierkorb kennzeichnet eine Komponente als gelöscht</w:t>
+      </w:r>
+    </w:p>
+    <w:p>
+      <w:r>
+        <w:t>&gt; beziehungsweise vom exportierten Ergebnis ausgeschlossen. Bewahren Sie die ursprüngliche IDX-Datei unverändert</w:t>
+      </w:r>
+    </w:p>
+    <w:p>
+      <w:r>
+        <w:t>&gt; auf und verwenden Sie für die Weiterverarbeitung den kontrollierten Export.</w:t>
       </w:r>
     </w:p>
     <w:p>
@@ -671,7 +909,20 @@
     </w:p>
     <w:p>
       <w:r>
-        <w:t>Wenn der Viewer über eine Projektwebseite bereitgestellt wird, öffnen Sie die entsprechende Adresse in Microsoft Edge oder Google Chrome.</w:t>
+        <w:t>Die öffentlich bereitgestellte Version ist unter</w:t>
+      </w:r>
+    </w:p>
+    <w:p>
+      <w:r>
+        <w:t>https://niclas85.github.io/IDX-Viewer/</w:t>
+      </w:r>
+      <w:r>
+        <w:t xml:space="preserve"> erreichbar. Öffnen Sie die Adresse</w:t>
+      </w:r>
+    </w:p>
+    <w:p>
+      <w:r>
+        <w:t>in Microsoft Edge oder Google Chrome.</w:t>
       </w:r>
     </w:p>
     <w:p>
@@ -1453,6 +1704,23 @@
         <w:pStyle w:val="ListBullet"/>
       </w:pPr>
       <w:r>
+        <w:t xml:space="preserve">die Option </w:t>
+      </w:r>
+      <w:r>
+        <w:rPr>
+          <w:b/>
+        </w:rPr>
+        <w:t>IDs neu nummerieren (Reihenfolge für Creo)</w:t>
+      </w:r>
+      <w:r>
+        <w:t>,</w:t>
+      </w:r>
+    </w:p>
+    <w:p>
+      <w:pPr>
+        <w:pStyle w:val="ListBullet"/>
+      </w:pPr>
+      <w:r>
         <w:t>Baseline und Inkremente,</w:t>
       </w:r>
     </w:p>
@@ -1461,7 +1729,16 @@
         <w:pStyle w:val="ListBullet"/>
       </w:pPr>
       <w:r>
-        <w:t>Hintmap und MCAD-Namen,</w:t>
+        <w:t xml:space="preserve">Hintmap und MCAD-Namen, einschließlich der Option </w:t>
+      </w:r>
+      <w:r>
+        <w:rPr>
+          <w:b/>
+        </w:rPr>
+        <w:t>MCAD-Namen beim Export ins File schreiben</w:t>
+      </w:r>
+      <w:r>
+        <w:t>,</w:t>
       </w:r>
     </w:p>
     <w:p>
@@ -1507,6 +1784,71 @@
     <w:p>
       <w:r>
         <w:t>Die blauen Abschnittsüberschriften können durch Anklicken ein- und ausgeklappt werden.</w:t>
+      </w:r>
+    </w:p>
+    <w:p>
+      <w:r>
+        <w:t xml:space="preserve">&gt; </w:t>
+      </w:r>
+      <w:r>
+        <w:rPr>
+          <w:b/>
+        </w:rPr>
+        <w:t>Hinweis zu den Abbildungen:</w:t>
+      </w:r>
+      <w:r>
+        <w:t xml:space="preserve"> Die Bildschirmfotos in dieser Anleitung stammen aus einer älteren</w:t>
+      </w:r>
+    </w:p>
+    <w:p>
+      <w:r>
+        <w:t xml:space="preserve">&gt; Version und zeigen die beiden Kontrollkästchen </w:t>
+      </w:r>
+      <w:r>
+        <w:rPr>
+          <w:b/>
+        </w:rPr>
+        <w:t>IDs neu nummerieren (Reihenfolge für Creo)</w:t>
+      </w:r>
+      <w:r>
+        <w:t xml:space="preserve"> und</w:t>
+      </w:r>
+    </w:p>
+    <w:p>
+      <w:r>
+        <w:t xml:space="preserve">&gt; </w:t>
+      </w:r>
+      <w:r>
+        <w:rPr>
+          <w:b/>
+        </w:rPr>
+        <w:t>MCAD-Namen beim Export ins File schreiben</w:t>
+      </w:r>
+      <w:r>
+        <w:t xml:space="preserve"> noch nicht. Das erste steht in der Kopfzeile neben den</w:t>
+      </w:r>
+    </w:p>
+    <w:p>
+      <w:r>
+        <w:t xml:space="preserve">&gt; Export-Schaltflächen, das zweite im Bereich </w:t>
+      </w:r>
+      <w:r>
+        <w:rPr>
+          <w:b/>
+        </w:rPr>
+        <w:t>Hintmap</w:t>
+      </w:r>
+      <w:r>
+        <w:t xml:space="preserve"> direkt unter </w:t>
+      </w:r>
+      <w:r>
+        <w:rPr>
+          <w:b/>
+        </w:rPr>
+        <w:t>MCAD Namen verwenden</w:t>
+      </w:r>
+      <w:r>
+        <w:t>.</w:t>
       </w:r>
     </w:p>
     <w:p>
@@ -1897,7 +2239,166 @@
         <w:t>Hinweis:</w:t>
       </w:r>
       <w:r>
-        <w:t xml:space="preserve"> Das Laden einer neuen Baseline ersetzt den bisherigen Arbeitsstand.</w:t>
+        <w:t xml:space="preserve"> Das Laden einer neuen Baseline ersetzt den bisherigen Arbeitsstand. Zurückgesetzt</w:t>
+      </w:r>
+    </w:p>
+    <w:p>
+      <w:r>
+        <w:t>&gt; werden dabei auch der Zeitstrahl, alle manuellen Änderungen, die gespeicherte Baumreihenfolge und</w:t>
+      </w:r>
+    </w:p>
+    <w:p>
+      <w:r>
+        <w:t>&gt; eine zuvor beim Export vergebene Nummerierung. Die Einstellungen der beiden Export-Optionen</w:t>
+      </w:r>
+    </w:p>
+    <w:p>
+      <w:r>
+        <w:t>&gt; bleiben erhalten, weil sie im Browser gespeichert werden.</w:t>
+      </w:r>
+    </w:p>
+    <w:p>
+      <w:pPr>
+        <w:pStyle w:val="Heading3"/>
+      </w:pPr>
+      <w:r>
+        <w:t>Automatische Prüfung vor dem Laden</w:t>
+      </w:r>
+    </w:p>
+    <w:p>
+      <w:r>
+        <w:t xml:space="preserve">Jede Datei wird geprüft, </w:t>
+      </w:r>
+      <w:r>
+        <w:rPr>
+          <w:b/>
+        </w:rPr>
+        <w:t>bevor</w:t>
+      </w:r>
+      <w:r>
+        <w:t xml:space="preserve"> sie übernommen wird. Geprüft werden unter anderem:</w:t>
+      </w:r>
+    </w:p>
+    <w:p>
+      <w:pPr>
+        <w:pStyle w:val="ListBullet"/>
+      </w:pPr>
+      <w:r>
+        <w:t>Dateiendung (</w:t>
+      </w:r>
+      <w:r>
+        <w:rPr>
+          <w:rFonts w:ascii="Consolas" w:hAnsi="Consolas"/>
+          <w:color w:val="5C3815"/>
+          <w:sz w:val="19"/>
+        </w:rPr>
+        <w:t>.idx</w:t>
+      </w:r>
+      <w:r>
+        <w:t xml:space="preserve"> oder </w:t>
+      </w:r>
+      <w:r>
+        <w:rPr>
+          <w:rFonts w:ascii="Consolas" w:hAnsi="Consolas"/>
+          <w:color w:val="5C3815"/>
+          <w:sz w:val="19"/>
+        </w:rPr>
+        <w:t>.xml</w:t>
+      </w:r>
+      <w:r>
+        <w:t>) und nicht leerer Inhalt,</w:t>
+      </w:r>
+    </w:p>
+    <w:p>
+      <w:pPr>
+        <w:pStyle w:val="ListBullet"/>
+      </w:pPr>
+      <w:r>
+        <w:t xml:space="preserve">wohlgeformtes XML und das Wurzelelement </w:t>
+      </w:r>
+      <w:r>
+        <w:rPr>
+          <w:rFonts w:ascii="Consolas" w:hAnsi="Consolas"/>
+          <w:color w:val="5C3815"/>
+          <w:sz w:val="19"/>
+        </w:rPr>
+        <w:t>EDMDDataSet</w:t>
+      </w:r>
+      <w:r>
+        <w:t>,</w:t>
+      </w:r>
+    </w:p>
+    <w:p>
+      <w:pPr>
+        <w:pStyle w:val="ListBullet"/>
+      </w:pPr>
+      <w:r>
+        <w:t>ein gültiger PROSTEP-EDMD/IDX-Namensraum,</w:t>
+      </w:r>
+    </w:p>
+    <w:p>
+      <w:pPr>
+        <w:pStyle w:val="ListBullet"/>
+      </w:pPr>
+      <w:r>
+        <w:t xml:space="preserve">der Header mit den Eigenschaften </w:t>
+      </w:r>
+      <w:r>
+        <w:rPr>
+          <w:rFonts w:ascii="Consolas" w:hAnsi="Consolas"/>
+          <w:color w:val="5C3815"/>
+          <w:sz w:val="19"/>
+        </w:rPr>
+        <w:t>IDX_MODE</w:t>
+      </w:r>
+      <w:r>
+        <w:t xml:space="preserve"> und </w:t>
+      </w:r>
+      <w:r>
+        <w:rPr>
+          <w:rFonts w:ascii="Consolas" w:hAnsi="Consolas"/>
+          <w:color w:val="5C3815"/>
+          <w:sz w:val="19"/>
+        </w:rPr>
+        <w:t>IDX_VERSION</w:t>
+      </w:r>
+      <w:r>
+        <w:t>,</w:t>
+      </w:r>
+    </w:p>
+    <w:p>
+      <w:pPr>
+        <w:pStyle w:val="ListBullet"/>
+      </w:pPr>
+      <w:r>
+        <w:t>auflösbare interne Verweise und gültige Zahlenwerte in Transformationen,</w:t>
+      </w:r>
+    </w:p>
+    <w:p>
+      <w:pPr>
+        <w:pStyle w:val="ListBullet"/>
+      </w:pPr>
+      <w:r>
+        <w:t>bei einer Baseline zusätzlich: Item-Definitionen, eine Assembly, ItemInstances und Geometrie.</w:t>
+      </w:r>
+    </w:p>
+    <w:p>
+      <w:r>
+        <w:t xml:space="preserve">Wird die Datei abgelehnt, erscheint ein Fenster mit allen gefundenen Fehlern und dem Hinweis </w:t>
+      </w:r>
+      <w:r>
+        <w:rPr>
+          <w:b/>
+        </w:rPr>
+        <w:t>Es wurde nichts importiert</w:t>
+      </w:r>
+      <w:r>
+        <w:t>. Der bisherige Arbeitsstand – Modell, Auswahl und Zeitstrahl – bleibt dabei unverändert. Schließen Sie das Fenster, korrigieren Sie die Datei und laden Sie sie erneut.</w:t>
+      </w:r>
+    </w:p>
+    <w:p>
+      <w:r>
+        <w:t>Unkritische Auffälligkeiten wie mehrfach verwendete IDs blockieren den Import nicht. Sie werden als Hinweis in der Browser-Konsole protokolliert.</w:t>
       </w:r>
     </w:p>
     <w:p>
@@ -2875,6 +3376,92 @@
     </w:p>
     <w:p>
       <w:r>
+        <w:t>Die eingestellte Reihenfolge wird gespeichert und bleibt erhalten, wenn der Modellbaum neu aufgebaut</w:t>
+      </w:r>
+    </w:p>
+    <w:p>
+      <w:r>
+        <w:t>wird – zum Beispiel beim Wechsel im Zeitstrahl, beim Löschen oder Wiederherstellen eines Bauteils</w:t>
+      </w:r>
+    </w:p>
+    <w:p>
+      <w:r>
+        <w:t>oder nach dem Neuladen der Seite. Beide Exporte (</w:t>
+      </w:r>
+      <w:r>
+        <w:rPr>
+          <w:b/>
+        </w:rPr>
+        <w:t>Export</w:t>
+      </w:r>
+      <w:r>
+        <w:t xml:space="preserve"> und </w:t>
+      </w:r>
+      <w:r>
+        <w:rPr>
+          <w:b/>
+        </w:rPr>
+        <w:t>Inkrement</w:t>
+      </w:r>
+      <w:r>
+        <w:t>) schreiben die</w:t>
+      </w:r>
+    </w:p>
+    <w:p>
+      <w:r>
+        <w:t>Einträge in genau dieser Reihenfolge.</w:t>
+      </w:r>
+    </w:p>
+    <w:p>
+      <w:r>
+        <w:t xml:space="preserve">&gt; </w:t>
+      </w:r>
+      <w:r>
+        <w:rPr>
+          <w:b/>
+        </w:rPr>
+        <w:t>Hinweis:</w:t>
+      </w:r>
+      <w:r>
+        <w:t xml:space="preserve"> Das IDX-Format verlangt, dass jede Instanz unterhalb ihrer Bauteildefinition steht.</w:t>
+      </w:r>
+    </w:p>
+    <w:p>
+      <w:r>
+        <w:t>&gt; Eine Reihenfolge, die Instanzen verschiedener Bauteile beliebig mischt, lässt sich im Dateiaufbau</w:t>
+      </w:r>
+    </w:p>
+    <w:p>
+      <w:r>
+        <w:t>&gt; deshalb nicht exakt abbilden. Für den beobachteten Creo-Import sind die Assembly-Item-IDs maßgeblich – siehe</w:t>
+      </w:r>
+    </w:p>
+    <w:p>
+      <w:r>
+        <w:t xml:space="preserve">&gt; Abschnitt 15.1, Option </w:t>
+      </w:r>
+      <w:r>
+        <w:rPr>
+          <w:b/>
+        </w:rPr>
+        <w:t>IDs neu nummerieren (Reihenfolge für Creo)</w:t>
+      </w:r>
+      <w:r>
+        <w:t>.</w:t>
+      </w:r>
+    </w:p>
+    <w:p>
+      <w:r>
+        <w:t>Beim Laden einer neuen Baseline wird die gespeicherte Reihenfolge zusammen mit den übrigen manuellen</w:t>
+      </w:r>
+    </w:p>
+    <w:p>
+      <w:r>
+        <w:t>Änderungen zurückgesetzt.</w:t>
+      </w:r>
+    </w:p>
+    <w:p>
+      <w:r>
         <w:br w:type="page"/>
       </w:r>
     </w:p>
@@ -3340,6 +3927,77 @@
           <w:sz w:val="17"/>
         </w:rPr>
         <w:t>Abbildung 7: Dateiauswahl zum gemeinsamen Laden der Inkremente</w:t>
+      </w:r>
+    </w:p>
+    <w:p>
+      <w:r>
+        <w:t xml:space="preserve">Auch hier wird jede Datei zuerst geprüft. Schlägt die Prüfung bei </w:t>
+      </w:r>
+      <w:r>
+        <w:rPr>
+          <w:b/>
+        </w:rPr>
+        <w:t>einer</w:t>
+      </w:r>
+      <w:r>
+        <w:t xml:space="preserve"> Datei fehl, wird der gesamte Ladevorgang abgebrochen und keine der ausgewählten Dateien übernommen. Das Fenster listet dann alle Dateien mit ihrem jeweiligen Ergebnis auf.</w:t>
+      </w:r>
+    </w:p>
+    <w:p>
+      <w:r>
+        <w:t xml:space="preserve">&gt; </w:t>
+      </w:r>
+      <w:r>
+        <w:rPr>
+          <w:b/>
+        </w:rPr>
+        <w:t>Hinweis:</w:t>
+      </w:r>
+      <w:r>
+        <w:t xml:space="preserve"> Werden Inkremente geladen, während bereits Inkremente im Zeitstrahl stehen, werden die neuen Dateien </w:t>
+      </w:r>
+      <w:r>
+        <w:rPr>
+          <w:b/>
+        </w:rPr>
+        <w:t>angehängt</w:t>
+      </w:r>
+      <w:r>
+        <w:t xml:space="preserve"> und ersetzen den bisherigen Zeitstrahl nicht. So lassen sich nachgelieferte Inkremente schrittweise ergänzen. Möchten Sie von vorne beginnen, laden Sie die Baseline erneut.</w:t>
+      </w:r>
+    </w:p>
+    <w:p>
+      <w:r>
+        <w:t>Eine Datei, die bereits im Zeitstrahl steht, wird dabei nicht ein zweites Mal übernommen. Die</w:t>
+      </w:r>
+    </w:p>
+    <w:p>
+      <w:r>
+        <w:t>Anwendung meldet das mit:</w:t>
+      </w:r>
+    </w:p>
+    <w:p>
+      <w:pPr>
+        <w:spacing w:before="60" w:after="140"/>
+        <w:ind w:left="255" w:right="142"/>
+        <w:shd w:fill="F2F2F2"/>
+      </w:pPr>
+      <w:r>
+        <w:rPr>
+          <w:rFonts w:ascii="Consolas" w:hAnsi="Consolas"/>
+          <w:sz w:val="18"/>
+        </w:rPr>
+        <w:t>Bereits geladen und daher übersprungen:</w:t>
+      </w:r>
+    </w:p>
+    <w:p>
+      <w:r>
+        <w:t>und übernimmt nur die übrigen Dateien. Das verhindert doppelt gezählte Änderungen und einen doppelten</w:t>
+      </w:r>
+    </w:p>
+    <w:p>
+      <w:r>
+        <w:t>Eintrag im Änderungsprotokoll der exportierten Baseline.</w:t>
       </w:r>
     </w:p>
     <w:p>
@@ -5030,12 +5688,196 @@
         <w:pStyle w:val="ListBullet"/>
       </w:pPr>
       <w:r>
-        <w:t>Zuordnung von OBJ-Dateien.</w:t>
+        <w:t>Zuordnung von OBJ-Dateien,</w:t>
+      </w:r>
+    </w:p>
+    <w:p>
+      <w:pPr>
+        <w:pStyle w:val="ListBullet"/>
+      </w:pPr>
+      <w:r>
+        <w:t>auf Wunsch zusätzlich der Inhalt der exportierten Datei (siehe unten).</w:t>
       </w:r>
     </w:p>
     <w:p>
       <w:r>
         <w:t>Die ursprünglichen Daten der Baseline werden durch das bloße Umschalten nicht umbenannt.</w:t>
+      </w:r>
+    </w:p>
+    <w:p>
+      <w:pPr>
+        <w:pStyle w:val="Heading3"/>
+      </w:pPr>
+      <w:r>
+        <w:t>MCAD-Namen beim Export ins File schreiben</w:t>
+      </w:r>
+    </w:p>
+    <w:p>
+      <w:r>
+        <w:t xml:space="preserve">Unter </w:t>
+      </w:r>
+      <w:r>
+        <w:rPr>
+          <w:b/>
+        </w:rPr>
+        <w:t>MCAD Namen verwenden</w:t>
+      </w:r>
+      <w:r>
+        <w:t xml:space="preserve"> steht die zusätzliche Option **MCAD-Namen beim Export ins File</w:t>
+      </w:r>
+    </w:p>
+    <w:p>
+      <w:r>
+        <w:t>schreiben**. Sie ist standardmäßig ausgeschaltet, wird für Ihren Browser gespeichert und ist nur</w:t>
+      </w:r>
+    </w:p>
+    <w:p>
+      <w:r>
+        <w:t xml:space="preserve">auswählbar, solange </w:t>
+      </w:r>
+      <w:r>
+        <w:rPr>
+          <w:b/>
+        </w:rPr>
+        <w:t>MCAD Namen verwenden</w:t>
+      </w:r>
+      <w:r>
+        <w:t xml:space="preserve"> aktiv ist.</w:t>
+      </w:r>
+    </w:p>
+    <w:p>
+      <w:pPr>
+        <w:pStyle w:val="ListBullet"/>
+      </w:pPr>
+      <w:r>
+        <w:rPr>
+          <w:b/>
+        </w:rPr>
+        <w:t>Ausgeschaltet (Standard):</w:t>
+      </w:r>
+      <w:r>
+        <w:t xml:space="preserve"> Die MCAD-Namen dienen nur der Anzeige. Die exportierte Datei enthält</w:t>
+      </w:r>
+    </w:p>
+    <w:p>
+      <w:r>
+        <w:t xml:space="preserve">  unverändert die ECAD-Namen.</w:t>
+      </w:r>
+    </w:p>
+    <w:p>
+      <w:pPr>
+        <w:pStyle w:val="ListBullet"/>
+      </w:pPr>
+      <w:r>
+        <w:rPr>
+          <w:b/>
+        </w:rPr>
+        <w:t>Eingeschaltet:</w:t>
+      </w:r>
+      <w:r>
+        <w:t xml:space="preserve"> Beim </w:t>
+      </w:r>
+      <w:r>
+        <w:rPr>
+          <w:b/>
+        </w:rPr>
+        <w:t>Export</w:t>
+      </w:r>
+      <w:r>
+        <w:t xml:space="preserve"> und beim </w:t>
+      </w:r>
+      <w:r>
+        <w:rPr>
+          <w:b/>
+        </w:rPr>
+        <w:t>Inkrement</w:t>
+      </w:r>
+      <w:r>
+        <w:t xml:space="preserve"> werden die zugeordneten Namen in die</w:t>
+      </w:r>
+    </w:p>
+    <w:p>
+      <w:r>
+        <w:t xml:space="preserve">  Exportkopie geschrieben, und zwar an genau die Stellen, aus denen der Viewer sie liest: der</w:t>
+      </w:r>
+    </w:p>
+    <w:p>
+      <w:r>
+        <w:t xml:space="preserve">  Instanzname der Komponente und die Materialnummer des zugehörigen Bauteils.</w:t>
+      </w:r>
+    </w:p>
+    <w:p>
+      <w:r>
+        <w:t>Bauteile ohne Eintrag in der Hintmap behalten ihren ursprünglichen Namen. Teilen sich mehrere</w:t>
+      </w:r>
+    </w:p>
+    <w:p>
+      <w:r>
+        <w:t>Instanzen dasselbe Bauteil, wird dessen Materialnummer genau einmal umgesetzt. Ergeben sich dabei</w:t>
+      </w:r>
+    </w:p>
+    <w:p>
+      <w:r>
+        <w:t>widersprüchliche Zuordnungen, bleibt die Originalnummer stehen.</w:t>
+      </w:r>
+    </w:p>
+    <w:p>
+      <w:r>
+        <w:t xml:space="preserve">&gt; </w:t>
+      </w:r>
+      <w:r>
+        <w:rPr>
+          <w:b/>
+        </w:rPr>
+        <w:t>Achtung:</w:t>
+      </w:r>
+      <w:r>
+        <w:t xml:space="preserve"> Namen sind im IDX auch ein Zuordnungsmerkmal. Löschmeldungen an das Zielsystem</w:t>
+      </w:r>
+    </w:p>
+    <w:p>
+      <w:r>
+        <w:t>&gt; (</w:t>
+      </w:r>
+      <w:r>
+        <w:rPr>
+          <w:rFonts w:ascii="Consolas" w:hAnsi="Consolas"/>
+          <w:color w:val="5C3815"/>
+          <w:sz w:val="19"/>
+        </w:rPr>
+        <w:t>DeletedInstanceName</w:t>
+      </w:r>
+      <w:r>
+        <w:t>) behalten deshalb immer den ECAD-Originalnamen, damit das Zielsystem die</w:t>
+      </w:r>
+    </w:p>
+    <w:p>
+      <w:r>
+        <w:t>&gt; betroffene Komponente weiterhin findet. Schalten Sie die Option nur ein, wenn das Zielsystem die</w:t>
+      </w:r>
+    </w:p>
+    <w:p>
+      <w:r>
+        <w:t>&gt; MCAD-Namen erwartet.</w:t>
+      </w:r>
+    </w:p>
+    <w:p>
+      <w:r>
+        <w:t xml:space="preserve">&gt; </w:t>
+      </w:r>
+      <w:r>
+        <w:rPr>
+          <w:b/>
+        </w:rPr>
+        <w:t>Hinweis:</w:t>
+      </w:r>
+      <w:r>
+        <w:t xml:space="preserve"> Auch diese Option verändert nur die exportierte Datei. Ihr Arbeitsstand im Viewer</w:t>
+      </w:r>
+    </w:p>
+    <w:p>
+      <w:r>
+        <w:t>&gt; bleibt unverändert.</w:t>
       </w:r>
     </w:p>
     <w:p>
@@ -5393,6 +6235,226 @@
       </w:r>
     </w:p>
     <w:p>
+      <w:r>
+        <w:t xml:space="preserve">Oben rechts steht zusätzlich die Option </w:t>
+      </w:r>
+      <w:r>
+        <w:rPr>
+          <w:b/>
+        </w:rPr>
+        <w:t>IDs neu nummerieren (Reihenfolge für Creo)</w:t>
+      </w:r>
+      <w:r>
+        <w:t>. Sie ist im</w:t>
+      </w:r>
+    </w:p>
+    <w:p>
+      <w:r>
+        <w:t xml:space="preserve">Auslieferungszustand </w:t>
+      </w:r>
+      <w:r>
+        <w:rPr>
+          <w:b/>
+        </w:rPr>
+        <w:t>eingeschaltet</w:t>
+      </w:r>
+      <w:r>
+        <w:t xml:space="preserve"> und wird für Ihren Browser gespeichert. Eine zuvor gespeicherte</w:t>
+      </w:r>
+    </w:p>
+    <w:p>
+      <w:r>
+        <w:t>Auswahl bleibt erhalten, auch wenn sie ausgeschaltet war.</w:t>
+      </w:r>
+    </w:p>
+    <w:p>
+      <w:pPr>
+        <w:pStyle w:val="ListBullet"/>
+      </w:pPr>
+      <w:r>
+        <w:rPr>
+          <w:b/>
+        </w:rPr>
+        <w:t>Ausgeschaltet:</w:t>
+      </w:r>
+      <w:r>
+        <w:t xml:space="preserve"> Die Instanz-IDs der Originaldatei bleiben unverändert. Im Export wird</w:t>
+      </w:r>
+    </w:p>
+    <w:p>
+      <w:r>
+        <w:t xml:space="preserve">  nur die Reihenfolge der Einträge in der Datei angepasst. Wählen Sie diese Einstellung, solange Sie</w:t>
+      </w:r>
+    </w:p>
+    <w:p>
+      <w:r>
+        <w:t xml:space="preserve">  mit ECAD-Inkrementen arbeiten, die sich auf die Original-IDs beziehen.</w:t>
+      </w:r>
+    </w:p>
+    <w:p>
+      <w:pPr>
+        <w:pStyle w:val="ListBullet"/>
+      </w:pPr>
+      <w:r>
+        <w:rPr>
+          <w:b/>
+        </w:rPr>
+        <w:t>Eingeschaltet (Standard):</w:t>
+      </w:r>
+      <w:r>
+        <w:t xml:space="preserve"> Die Instanz-IDs (zum Beispiel </w:t>
+      </w:r>
+      <w:r>
+        <w:rPr>
+          <w:rFonts w:ascii="Consolas" w:hAnsi="Consolas"/>
+          <w:color w:val="5C3815"/>
+          <w:sz w:val="19"/>
+        </w:rPr>
+        <w:t>ITEM_INST_1</w:t>
+      </w:r>
+      <w:r>
+        <w:t xml:space="preserve">, </w:t>
+      </w:r>
+      <w:r>
+        <w:rPr>
+          <w:rFonts w:ascii="Consolas" w:hAnsi="Consolas"/>
+          <w:color w:val="5C3815"/>
+          <w:sz w:val="19"/>
+        </w:rPr>
+        <w:t>ITEM_INST_2</w:t>
+      </w:r>
+      <w:r>
+        <w:t>, ...) werden fortlaufend</w:t>
+      </w:r>
+    </w:p>
+    <w:p>
+      <w:r>
+        <w:t xml:space="preserve">  gemäß der Reihenfolge im Modellbaum vergeben. Zusätzlich werden die übergeordneten Assembly-Item-IDs</w:t>
+      </w:r>
+    </w:p>
+    <w:p>
+      <w:r>
+        <w:t xml:space="preserve">  neu vergeben, mit gleich breiten Nummern und führenden Nullen (etwa </w:t>
+      </w:r>
+      <w:r>
+        <w:rPr>
+          <w:rFonts w:ascii="Consolas" w:hAnsi="Consolas"/>
+          <w:color w:val="5C3815"/>
+          <w:sz w:val="19"/>
+        </w:rPr>
+        <w:t>ITEM_0001</w:t>
+      </w:r>
+      <w:r>
+        <w:t xml:space="preserve">, </w:t>
+      </w:r>
+      <w:r>
+        <w:rPr>
+          <w:rFonts w:ascii="Consolas" w:hAnsi="Consolas"/>
+          <w:color w:val="5C3815"/>
+          <w:sz w:val="19"/>
+        </w:rPr>
+        <w:t>ITEM_0002</w:t>
+      </w:r>
+      <w:r>
+        <w:t>).</w:t>
+      </w:r>
+    </w:p>
+    <w:p>
+      <w:r>
+        <w:t xml:space="preserve">  Der untersuchte Creo-Import sortiert diese IDs alphabetisch, nicht numerisch.</w:t>
+      </w:r>
+    </w:p>
+    <w:p>
+      <w:r>
+        <w:t xml:space="preserve">  Das vorherrschende Präfix bleibt erhalten; bei Kollisionen wird die Nummernbreite erhöht.</w:t>
+      </w:r>
+    </w:p>
+    <w:p>
+      <w:r>
+        <w:t xml:space="preserve">  Referenzen werden mit angepasst. Gemeinsam genutzte Assembly-Items erhalten den Rang ihrer ersten</w:t>
+      </w:r>
+    </w:p>
+    <w:p>
+      <w:r>
+        <w:t xml:space="preserve">  Instanz; eine beliebige Mischung über solche Gruppen hinweg ist damit nicht darstellbar.</w:t>
+      </w:r>
+    </w:p>
+    <w:p>
+      <w:r>
+        <w:t xml:space="preserve">  Manuelle Instanzen werden ebenfalls nummeriert, bleiben aber in ihrer gemeinsamen Assembly.</w:t>
+      </w:r>
+    </w:p>
+    <w:p>
+      <w:r>
+        <w:t xml:space="preserve">  Zusätzlich sortiert der Export die Bauteil-Definitionen (</w:t>
+      </w:r>
+      <w:r>
+        <w:rPr>
+          <w:rFonts w:ascii="Consolas" w:hAnsi="Consolas"/>
+          <w:color w:val="5C3815"/>
+          <w:sz w:val="19"/>
+        </w:rPr>
+        <w:t>&lt;Item&gt;</w:t>
+      </w:r>
+      <w:r>
+        <w:t xml:space="preserve"> mit </w:t>
+      </w:r>
+      <w:r>
+        <w:rPr>
+          <w:rFonts w:ascii="Consolas" w:hAnsi="Consolas"/>
+          <w:color w:val="5C3815"/>
+          <w:sz w:val="19"/>
+        </w:rPr>
+        <w:t>&lt;ItemType&gt;single&lt;/ItemType&gt;</w:t>
+      </w:r>
+      <w:r>
+        <w:t>)</w:t>
+      </w:r>
+    </w:p>
+    <w:p>
+      <w:r>
+        <w:t xml:space="preserve">  unmittelbar vor der Baugruppe ebenfalls in dieselbe Reihenfolge wie den Modellbaum.</w:t>
+      </w:r>
+    </w:p>
+    <w:p>
+      <w:r>
+        <w:t xml:space="preserve">&gt; </w:t>
+      </w:r>
+      <w:r>
+        <w:rPr>
+          <w:b/>
+        </w:rPr>
+        <w:t>Achtung:</w:t>
+      </w:r>
+      <w:r>
+        <w:t xml:space="preserve"> ECAD-Inkremente verweisen auf die Original-IDs. Nach dem Umnummerieren passen sie nur</w:t>
+      </w:r>
+    </w:p>
+    <w:p>
+      <w:r>
+        <w:t>&gt; noch zu der neu exportierten Baseline. Schalten Sie die Option deshalb nur ein, wenn die Reihenfolge</w:t>
+      </w:r>
+    </w:p>
+    <w:p>
+      <w:r>
+        <w:t>&gt; in Creo stimmen muss, und geben Sie die neu exportierte Baseline im Austauschprozess weiter.</w:t>
+      </w:r>
+    </w:p>
+    <w:p>
+      <w:r>
+        <w:t xml:space="preserve">&gt; </w:t>
+      </w:r>
+      <w:r>
+        <w:rPr>
+          <w:b/>
+        </w:rPr>
+        <w:t>Hinweis:</w:t>
+      </w:r>
+      <w:r>
+        <w:t xml:space="preserve"> Die Nummerierung ändert nur die exportierte Datei. Ihr Arbeitsstand im Viewer bleibt unverändert.</w:t>
+      </w:r>
+    </w:p>
+    <w:p>
       <w:pPr>
         <w:pStyle w:val="Heading3"/>
       </w:pPr>
@@ -5469,6 +6531,25 @@
     </w:p>
     <w:p>
       <w:r>
+        <w:t xml:space="preserve">Ist </w:t>
+      </w:r>
+      <w:r>
+        <w:rPr>
+          <w:b/>
+        </w:rPr>
+        <w:t>MCAD-Namen beim Export ins File schreiben</w:t>
+      </w:r>
+      <w:r>
+        <w:t xml:space="preserve"> aktiv, gilt das auch für das Inkrement. Löschmeldungen</w:t>
+      </w:r>
+    </w:p>
+    <w:p>
+      <w:r>
+        <w:t>verwenden dabei weiterhin den ECAD-Originalnamen (siehe Abschnitt 13).</w:t>
+      </w:r>
+    </w:p>
+    <w:p>
+      <w:r>
         <w:t>Wenn keine neue Änderung vorhanden ist, erscheint:</w:t>
       </w:r>
     </w:p>
@@ -5484,6 +6565,81 @@
           <w:sz w:val="18"/>
         </w:rPr>
         <w:t>Keine neuen Änderungen!</w:t>
+      </w:r>
+    </w:p>
+    <w:p>
+      <w:r>
+        <w:t xml:space="preserve">Ein Inkrement verweist auf die Instanzen der Baseline. Die Instanz-IDs werden hier deshalb </w:t>
+      </w:r>
+      <w:r>
+        <w:rPr>
+          <w:b/>
+        </w:rPr>
+        <w:t>nie</w:t>
+      </w:r>
+    </w:p>
+    <w:p>
+      <w:r>
+        <w:t>eigenständig neu nummeriert. Haben Sie in derselben Sitzung eine Baseline mit eingeschalteter Option</w:t>
+      </w:r>
+    </w:p>
+    <w:p>
+      <w:r>
+        <w:rPr>
+          <w:b/>
+        </w:rPr>
+        <w:t>IDs neu nummerieren</w:t>
+      </w:r>
+      <w:r>
+        <w:t xml:space="preserve"> exportiert, kennt das Zielsystem nur noch die neuen IDs. Das Inkrement</w:t>
+      </w:r>
+    </w:p>
+    <w:p>
+      <w:r>
+        <w:t>übernimmt dann automatisch dieselbe Nummerierung – auch dann, wenn die Option inzwischen wieder</w:t>
+      </w:r>
+    </w:p>
+    <w:p>
+      <w:r>
+        <w:t>ausgeschaltet wurde. Sie erhalten in diesem Fall einen Hinweis. Ohne solchen Export bleiben die</w:t>
+      </w:r>
+    </w:p>
+    <w:p>
+      <w:r>
+        <w:t>Original-IDs erhalten.</w:t>
+      </w:r>
+    </w:p>
+    <w:p>
+      <w:r>
+        <w:t>Wurde die Reihenfolge im Modellbaum nach dem letzten Export geändert, behält das Inkrement die</w:t>
+      </w:r>
+    </w:p>
+    <w:p>
+      <w:r>
+        <w:t>Original-IDs und meldet das. Exportieren Sie dann die Baseline erneut, damit Baseline und Inkrement</w:t>
+      </w:r>
+    </w:p>
+    <w:p>
+      <w:r>
+        <w:t xml:space="preserve">zusammenpassen. Empfohlene Reihenfolge ist daher: erst </w:t>
+      </w:r>
+      <w:r>
+        <w:rPr>
+          <w:b/>
+        </w:rPr>
+        <w:t>Export</w:t>
+      </w:r>
+      <w:r>
+        <w:t xml:space="preserve">, dann </w:t>
+      </w:r>
+      <w:r>
+        <w:rPr>
+          <w:b/>
+        </w:rPr>
+        <w:t>Inkrement</w:t>
+      </w:r>
+      <w:r>
+        <w:t>.</w:t>
       </w:r>
     </w:p>
     <w:p>
@@ -7947,6 +9103,374 @@
         <w:pStyle w:val="Heading3"/>
       </w:pPr>
       <w:r>
+        <w:t>Die Datei wird beim Laden abgelehnt</w:t>
+      </w:r>
+    </w:p>
+    <w:p>
+      <w:r>
+        <w:t xml:space="preserve">Es erscheint ein Fenster mit dem Hinweis </w:t>
+      </w:r>
+      <w:r>
+        <w:rPr>
+          <w:b/>
+        </w:rPr>
+        <w:t>Es wurde nichts importiert</w:t>
+      </w:r>
+      <w:r>
+        <w:t>.</w:t>
+      </w:r>
+    </w:p>
+    <w:p>
+      <w:pPr>
+        <w:pStyle w:val="ListBullet"/>
+      </w:pPr>
+      <w:r>
+        <w:t>Die aufgeführten Fehlermeldungen einzeln abarbeiten.</w:t>
+      </w:r>
+    </w:p>
+    <w:p>
+      <w:pPr>
+        <w:pStyle w:val="ListBullet"/>
+      </w:pPr>
+      <w:r>
+        <w:t>Prüfen, ob es sich wirklich um eine IDX-Datei handelt und nicht um eine Fehlerseite oder eine umbenannte Datei.</w:t>
+      </w:r>
+    </w:p>
+    <w:p>
+      <w:pPr>
+        <w:pStyle w:val="ListBullet"/>
+      </w:pPr>
+      <w:r>
+        <w:t xml:space="preserve">Bei </w:t>
+      </w:r>
+      <w:r>
+        <w:rPr>
+          <w:b/>
+        </w:rPr>
+        <w:t>Das XML ist nicht wohlgeformt</w:t>
+      </w:r>
+      <w:r>
+        <w:t xml:space="preserve"> ist die Datei beschädigt oder unvollständig übertragen worden; bitte neu anfordern.</w:t>
+      </w:r>
+    </w:p>
+    <w:p>
+      <w:pPr>
+        <w:pStyle w:val="ListBullet"/>
+      </w:pPr>
+      <w:r>
+        <w:t xml:space="preserve">Bei </w:t>
+      </w:r>
+      <w:r>
+        <w:rPr>
+          <w:b/>
+        </w:rPr>
+        <w:t>Nicht auflösbare IDX-Referenzen</w:t>
+      </w:r>
+      <w:r>
+        <w:t xml:space="preserve"> in einem Inkrement zuerst die passende Baseline laden, da die Verweise auf sie zeigen.</w:t>
+      </w:r>
+    </w:p>
+    <w:p>
+      <w:pPr>
+        <w:pStyle w:val="ListBullet"/>
+      </w:pPr>
+      <w:r>
+        <w:t xml:space="preserve">Bei fehlendem </w:t>
+      </w:r>
+      <w:r>
+        <w:rPr>
+          <w:rFonts w:ascii="Consolas" w:hAnsi="Consolas"/>
+          <w:color w:val="5C3815"/>
+          <w:sz w:val="19"/>
+        </w:rPr>
+        <w:t>IDX_MODE</w:t>
+      </w:r>
+      <w:r>
+        <w:t xml:space="preserve"> oder </w:t>
+      </w:r>
+      <w:r>
+        <w:rPr>
+          <w:rFonts w:ascii="Consolas" w:hAnsi="Consolas"/>
+          <w:color w:val="5C3815"/>
+          <w:sz w:val="19"/>
+        </w:rPr>
+        <w:t>IDX_VERSION</w:t>
+      </w:r>
+      <w:r>
+        <w:t xml:space="preserve"> den Ersteller der Datei kontaktieren.</w:t>
+      </w:r>
+    </w:p>
+    <w:p>
+      <w:r>
+        <w:t>Der bisherige Arbeitsstand bleibt in allen Fällen erhalten.</w:t>
+      </w:r>
+    </w:p>
+    <w:p>
+      <w:pPr>
+        <w:pStyle w:val="Heading3"/>
+      </w:pPr>
+      <w:r>
+        <w:t>Die Datei wird abgelehnt, weil IDX_MODE oder IDX_VERSION fehlt</w:t>
+      </w:r>
+    </w:p>
+    <w:p>
+      <w:r>
+        <w:t xml:space="preserve">Die Meldung lautet </w:t>
+      </w:r>
+      <w:r>
+        <w:rPr>
+          <w:b/>
+        </w:rPr>
+        <w:t>Im Header fehlt die Eigenschaft IDX_MODE.</w:t>
+      </w:r>
+      <w:r>
+        <w:t xml:space="preserve"> beziehungsweise entsprechend für</w:t>
+      </w:r>
+    </w:p>
+    <w:p>
+      <w:r>
+        <w:rPr>
+          <w:rFonts w:ascii="Consolas" w:hAnsi="Consolas"/>
+          <w:color w:val="5C3815"/>
+          <w:sz w:val="19"/>
+        </w:rPr>
+        <w:t>IDX_VERSION</w:t>
+      </w:r>
+      <w:r>
+        <w:t>.</w:t>
+      </w:r>
+    </w:p>
+    <w:p>
+      <w:pPr>
+        <w:pStyle w:val="ListBullet"/>
+      </w:pPr>
+      <w:r>
+        <w:t xml:space="preserve">Beide Angaben gehören in den </w:t>
+      </w:r>
+      <w:r>
+        <w:rPr>
+          <w:rFonts w:ascii="Consolas" w:hAnsi="Consolas"/>
+          <w:color w:val="5C3815"/>
+          <w:sz w:val="19"/>
+        </w:rPr>
+        <w:t>Header</w:t>
+      </w:r>
+      <w:r>
+        <w:t xml:space="preserve"> der IDX-Datei und werden von regulären ECAD- und</w:t>
+      </w:r>
+    </w:p>
+    <w:p>
+      <w:r>
+        <w:t xml:space="preserve">  MCAD-Exporten mitgeschrieben.</w:t>
+      </w:r>
+    </w:p>
+    <w:p>
+      <w:pPr>
+        <w:pStyle w:val="ListBullet"/>
+      </w:pPr>
+      <w:r>
+        <w:t>Fehlen sie, wurde die Datei meist nachträglich von Hand bearbeitet oder stammt aus einem</w:t>
+      </w:r>
+    </w:p>
+    <w:p>
+      <w:r>
+        <w:t xml:space="preserve">  Teilexport. Bitte den Ersteller um einen vollständigen Neuexport.</w:t>
+      </w:r>
+    </w:p>
+    <w:p>
+      <w:pPr>
+        <w:pStyle w:val="ListBullet"/>
+      </w:pPr>
+      <w:r>
+        <w:t>Ein Auszug aus einer IDX-Datei (etwa nur der Änderungsteil) ist keine gültige Eingabedatei.</w:t>
+      </w:r>
+    </w:p>
+    <w:p>
+      <w:r>
+        <w:t>Der Viewer übernimmt in diesem Fall nichts; Modell und Zeitstrahl bleiben unverändert.</w:t>
+      </w:r>
+    </w:p>
+    <w:p>
+      <w:pPr>
+        <w:pStyle w:val="Heading3"/>
+      </w:pPr>
+      <w:r>
+        <w:t>Die Reihenfolge in Creo stimmt nicht</w:t>
+      </w:r>
+    </w:p>
+    <w:p>
+      <w:r>
+        <w:t>Beim untersuchten Creo-Import entspricht die Komponentenreihenfolge der alphabetischen Sortierung</w:t>
+      </w:r>
+    </w:p>
+    <w:p>
+      <w:r>
+        <w:t>der übergeordneten Assembly-Item-IDs. Nur Instanznummern oder XML-Einträge zu sortieren reicht nicht.</w:t>
+      </w:r>
+    </w:p>
+    <w:p>
+      <w:pPr>
+        <w:pStyle w:val="ListBullet"/>
+      </w:pPr>
+      <w:r>
+        <w:t xml:space="preserve">Schalten Sie vor dem Export die Option </w:t>
+      </w:r>
+      <w:r>
+        <w:rPr>
+          <w:b/>
+        </w:rPr>
+        <w:t>IDs neu nummerieren (Reihenfolge für Creo)</w:t>
+      </w:r>
+      <w:r>
+        <w:t xml:space="preserve"> ein.</w:t>
+      </w:r>
+    </w:p>
+    <w:p>
+      <w:pPr>
+        <w:pStyle w:val="ListBullet"/>
+      </w:pPr>
+      <w:r>
+        <w:t xml:space="preserve">Sortieren Sie den Modellbaum vollständig, </w:t>
+      </w:r>
+      <w:r>
+        <w:rPr>
+          <w:b/>
+        </w:rPr>
+        <w:t>bevor</w:t>
+      </w:r>
+      <w:r>
+        <w:t xml:space="preserve"> Sie exportieren.</w:t>
+      </w:r>
+    </w:p>
+    <w:p>
+      <w:pPr>
+        <w:pStyle w:val="ListBullet"/>
+      </w:pPr>
+      <w:r>
+        <w:t xml:space="preserve">Exportieren Sie in der Reihenfolge: erst </w:t>
+      </w:r>
+      <w:r>
+        <w:rPr>
+          <w:b/>
+        </w:rPr>
+        <w:t>Export</w:t>
+      </w:r>
+      <w:r>
+        <w:t xml:space="preserve"> (Baseline), danach </w:t>
+      </w:r>
+      <w:r>
+        <w:rPr>
+          <w:b/>
+        </w:rPr>
+        <w:t>Inkrement</w:t>
+      </w:r>
+      <w:r>
+        <w:t>.</w:t>
+      </w:r>
+    </w:p>
+    <w:p>
+      <w:pPr>
+        <w:pStyle w:val="ListBullet"/>
+      </w:pPr>
+      <w:r>
+        <w:t>Geben Sie die neu exportierte Baseline weiter, nicht die ursprüngliche Datei.</w:t>
+      </w:r>
+    </w:p>
+    <w:p>
+      <w:r>
+        <w:t>Der Export bringt dabei drei Dinge gleichzeitig in die Baumreihenfolge: die Einträge der Komponenten,</w:t>
+      </w:r>
+    </w:p>
+    <w:p>
+      <w:r>
+        <w:t>deren Instanznummern und Assembly-Item-IDs (nur bei eingeschalteter Option) und die Reihenfolge der zugehörigen</w:t>
+      </w:r>
+    </w:p>
+    <w:p>
+      <w:r>
+        <w:t>Bauteil-Definitionen in der Datei. Die Bauteil-Definitionen bleiben weiterhin vor der Baugruppe</w:t>
+      </w:r>
+    </w:p>
+    <w:p>
+      <w:r>
+        <w:t>stehen, damit die Datei gültig bleibt.</w:t>
+      </w:r>
+    </w:p>
+    <w:p>
+      <w:r>
+        <w:t>Bleibt die Reihenfolge in Creo danach immer noch unverändert, öffnen Sie die exportierte Datei in</w:t>
+      </w:r>
+    </w:p>
+    <w:p>
+      <w:r>
+        <w:t>einem Texteditor und prüfen Sie, ob die Komponenten dort tatsächlich in Ihrer Wunschreihenfolge</w:t>
+      </w:r>
+    </w:p>
+    <w:p>
+      <w:r>
+        <w:t>stehen. Ist das der Fall, wertet Creo beim Import ein anderes Kriterium aus (etwa den Bauteilnamen);</w:t>
+      </w:r>
+    </w:p>
+    <w:p>
+      <w:r>
+        <w:t>bitte melden Sie das mit der exportierten Datei zurück.</w:t>
+      </w:r>
+    </w:p>
+    <w:p>
+      <w:pPr>
+        <w:pStyle w:val="Heading3"/>
+      </w:pPr>
+      <w:r>
+        <w:t>Das Inkrement passt nach der Neunummerierung nicht zur Baseline</w:t>
+      </w:r>
+    </w:p>
+    <w:p>
+      <w:pPr>
+        <w:pStyle w:val="ListBullet"/>
+      </w:pPr>
+      <w:r>
+        <w:t>Prüfen Sie, ob die Baseline nach der letzten Änderung der Reihenfolge noch einmal exportiert wurde.</w:t>
+      </w:r>
+    </w:p>
+    <w:p>
+      <w:r>
+        <w:t xml:space="preserve">  Wurde der Modellbaum danach umsortiert, behält das Inkrement die Original-IDs und meldet das.</w:t>
+      </w:r>
+    </w:p>
+    <w:p>
+      <w:pPr>
+        <w:pStyle w:val="ListBullet"/>
+      </w:pPr>
+      <w:r>
+        <w:t>Exportieren Sie in diesem Fall zuerst die Baseline erneut und danach das Inkrement.</w:t>
+      </w:r>
+    </w:p>
+    <w:p>
+      <w:pPr>
+        <w:pStyle w:val="ListBullet"/>
+      </w:pPr>
+      <w:r>
+        <w:t>Geben Sie Baseline und Inkrement immer als Paar aus derselben Sitzung weiter.</w:t>
+      </w:r>
+    </w:p>
+    <w:p>
+      <w:pPr>
+        <w:pStyle w:val="ListBullet"/>
+      </w:pPr>
+      <w:r>
+        <w:t>Wurde die Baseline beim Partner ohne Neunummerierung eingelesen, schalten Sie die Option aus und</w:t>
+      </w:r>
+    </w:p>
+    <w:p>
+      <w:r>
+        <w:t xml:space="preserve">  exportieren Sie beide Dateien erneut.</w:t>
+      </w:r>
+    </w:p>
+    <w:p>
+      <w:pPr>
+        <w:pStyle w:val="Heading3"/>
+      </w:pPr>
+      <w:r>
         <w:t>Die Seite ist leer</w:t>
       </w:r>
     </w:p>
@@ -8450,6 +9974,71 @@
         <w:pStyle w:val="ListBullet"/>
       </w:pPr>
       <w:r>
+        <w:t>☐ Modellbaum vor dem Export vollständig sortiert</w:t>
+      </w:r>
+    </w:p>
+    <w:p>
+      <w:pPr>
+        <w:pStyle w:val="ListBullet"/>
+      </w:pPr>
+      <w:r>
+        <w:t xml:space="preserve">☐ Option </w:t>
+      </w:r>
+      <w:r>
+        <w:rPr>
+          <w:b/>
+        </w:rPr>
+        <w:t>IDs neu nummerieren (Reihenfolge für Creo)</w:t>
+      </w:r>
+      <w:r>
+        <w:t xml:space="preserve"> bewusst gesetzt</w:t>
+      </w:r>
+    </w:p>
+    <w:p>
+      <w:pPr>
+        <w:pStyle w:val="ListBullet"/>
+      </w:pPr>
+      <w:r>
+        <w:t xml:space="preserve">☐ Option </w:t>
+      </w:r>
+      <w:r>
+        <w:rPr>
+          <w:b/>
+        </w:rPr>
+        <w:t>MCAD-Namen beim Export ins File schreiben</w:t>
+      </w:r>
+      <w:r>
+        <w:t xml:space="preserve"> bewusst gesetzt</w:t>
+      </w:r>
+    </w:p>
+    <w:p>
+      <w:pPr>
+        <w:pStyle w:val="ListBullet"/>
+      </w:pPr>
+      <w:r>
+        <w:t xml:space="preserve">☐ Bei Neunummerierung: erst </w:t>
+      </w:r>
+      <w:r>
+        <w:rPr>
+          <w:b/>
+        </w:rPr>
+        <w:t>Export</w:t>
+      </w:r>
+      <w:r>
+        <w:t xml:space="preserve">, dann </w:t>
+      </w:r>
+      <w:r>
+        <w:rPr>
+          <w:b/>
+        </w:rPr>
+        <w:t>Inkrement</w:t>
+      </w:r>
+    </w:p>
+    <w:p>
+      <w:pPr>
+        <w:pStyle w:val="ListBullet"/>
+      </w:pPr>
+      <w:r>
         <w:t>☐ Datei erfolgreich heruntergeladen</w:t>
       </w:r>
     </w:p>
@@ -8475,6 +10064,507 @@
       </w:pPr>
       <w:r>
         <w:t>☐ Ausgangsdateien und Export gemeinsam archiviert</w:t>
+      </w:r>
+    </w:p>
+    <w:p>
+      <w:r>
+        <w:br w:type="page"/>
+      </w:r>
+    </w:p>
+    <w:p>
+      <w:pPr>
+        <w:pStyle w:val="Heading2"/>
+      </w:pPr>
+      <w:r>
+        <w:t>21. Änderungen / Versionshinweise</w:t>
+      </w:r>
+    </w:p>
+    <w:p>
+      <w:pPr>
+        <w:pStyle w:val="Heading3"/>
+      </w:pPr>
+      <w:r>
+        <w:t>01.10.2026</w:t>
+      </w:r>
+    </w:p>
+    <w:p>
+      <w:pPr>
+        <w:pStyle w:val="ListBullet"/>
+      </w:pPr>
+      <w:r>
+        <w:rPr>
+          <w:b/>
+        </w:rPr>
+        <w:t>Bereinigung des Repositories:</w:t>
+      </w:r>
+      <w:r>
+        <w:t xml:space="preserve"> Entfernung proprietärer PDF-Spezifikationen sowie tooling-spezifischer Ordner (</w:t>
+      </w:r>
+      <w:r>
+        <w:rPr>
+          <w:rFonts w:ascii="Consolas" w:hAnsi="Consolas"/>
+          <w:color w:val="5C3815"/>
+          <w:sz w:val="19"/>
+        </w:rPr>
+        <w:t>.gemini/</w:t>
+      </w:r>
+      <w:r>
+        <w:t xml:space="preserve">, </w:t>
+      </w:r>
+      <w:r>
+        <w:rPr>
+          <w:rFonts w:ascii="Consolas" w:hAnsi="Consolas"/>
+          <w:color w:val="5C3815"/>
+          <w:sz w:val="19"/>
+        </w:rPr>
+        <w:t>.codex/</w:t>
+      </w:r>
+      <w:r>
+        <w:t xml:space="preserve">) aus dem gesamten Git-Verlauf und Ergänzung von </w:t>
+      </w:r>
+      <w:r>
+        <w:rPr>
+          <w:rFonts w:ascii="Consolas" w:hAnsi="Consolas"/>
+          <w:color w:val="5C3815"/>
+          <w:sz w:val="19"/>
+        </w:rPr>
+        <w:t>.gitignore</w:t>
+      </w:r>
+      <w:r>
+        <w:t>.</w:t>
+      </w:r>
+    </w:p>
+    <w:p>
+      <w:pPr>
+        <w:pStyle w:val="ListBullet"/>
+      </w:pPr>
+      <w:r>
+        <w:rPr>
+          <w:b/>
+        </w:rPr>
+        <w:t>Aktualisierung und Konsolidierung der Dokumentation:</w:t>
+      </w:r>
+      <w:r>
+        <w:t xml:space="preserve"> Vollständige Aktualisierung von </w:t>
+      </w:r>
+      <w:r>
+        <w:rPr>
+          <w:rFonts w:ascii="Consolas" w:hAnsi="Consolas"/>
+          <w:color w:val="5C3815"/>
+          <w:sz w:val="19"/>
+        </w:rPr>
+        <w:t>Anwenderdokumentation.md</w:t>
+      </w:r>
+      <w:r>
+        <w:t xml:space="preserve">, </w:t>
+      </w:r>
+      <w:r>
+        <w:rPr>
+          <w:rFonts w:ascii="Consolas" w:hAnsi="Consolas"/>
+          <w:color w:val="5C3815"/>
+          <w:sz w:val="19"/>
+        </w:rPr>
+        <w:t>Anwenderdokumentation.docx</w:t>
+      </w:r>
+      <w:r>
+        <w:t xml:space="preserve"> und </w:t>
+      </w:r>
+      <w:r>
+        <w:rPr>
+          <w:rFonts w:ascii="Consolas" w:hAnsi="Consolas"/>
+          <w:color w:val="5C3815"/>
+          <w:sz w:val="19"/>
+        </w:rPr>
+        <w:t>help.html</w:t>
+      </w:r>
+      <w:r>
+        <w:t xml:space="preserve"> bezüglich aller kürzlich hinzugekommenen Funktionen (Standardaktivierung der Creo-Neunummerierung, Ordnung von Bauteildefinitionen, Transaktionssicherheit beim Laden und Inkonsistenzwarnungen).</w:t>
+      </w:r>
+    </w:p>
+    <w:p>
+      <w:pPr>
+        <w:pStyle w:val="Heading3"/>
+      </w:pPr>
+      <w:r>
+        <w:t>25.09.2026</w:t>
+      </w:r>
+    </w:p>
+    <w:p>
+      <w:pPr>
+        <w:pStyle w:val="ListBullet"/>
+      </w:pPr>
+      <w:r>
+        <w:t>Die Neunummerierung ist standardmäßig eingeschaltet; gespeicherte Benutzereinstellungen bleiben erhalten.</w:t>
+      </w:r>
+    </w:p>
+    <w:p>
+      <w:pPr>
+        <w:pStyle w:val="ListBullet"/>
+      </w:pPr>
+      <w:r>
+        <w:rPr>
+          <w:b/>
+        </w:rPr>
+        <w:t>IDs neu nummerieren (Reihenfolge für Creo)</w:t>
+      </w:r>
+      <w:r>
+        <w:t xml:space="preserve"> nummeriert zusätzlich die Assembly-Item-IDs</w:t>
+      </w:r>
+    </w:p>
+    <w:p>
+      <w:r>
+        <w:t xml:space="preserve">  mit führenden Nullen nach Baumreihenfolge. Dies berücksichtigt die im Creo-Import beobachtete</w:t>
+      </w:r>
+    </w:p>
+    <w:p>
+      <w:r>
+        <w:t xml:space="preserve">  alphabetische Sortierung dieser IDs.</w:t>
+      </w:r>
+    </w:p>
+    <w:p>
+      <w:pPr>
+        <w:pStyle w:val="ListBullet"/>
+      </w:pPr>
+      <w:r>
+        <w:t>Inkremente übernehmen auch diese ID-Abbildung aus dem letzten Baseline-Export, einschließlich</w:t>
+      </w:r>
+    </w:p>
+    <w:p>
+      <w:r>
+        <w:t xml:space="preserve">  </w:t>
+      </w:r>
+      <w:r>
+        <w:rPr>
+          <w:rFonts w:ascii="Consolas" w:hAnsi="Consolas"/>
+          <w:color w:val="5C3815"/>
+          <w:sz w:val="19"/>
+        </w:rPr>
+        <w:t>PredecessorItem</w:t>
+      </w:r>
+      <w:r>
+        <w:t xml:space="preserve">-Referenzen. Neue Revisionen behalten ihre eigenen IDs und </w:t>
+      </w:r>
+      <w:r>
+        <w:rPr>
+          <w:rFonts w:ascii="Consolas" w:hAnsi="Consolas"/>
+          <w:color w:val="5C3815"/>
+          <w:sz w:val="19"/>
+        </w:rPr>
+        <w:t>NewItem</w:t>
+      </w:r>
+      <w:r>
+        <w:t>-Referenzen.</w:t>
+      </w:r>
+    </w:p>
+    <w:p>
+      <w:pPr>
+        <w:pStyle w:val="ListBullet"/>
+      </w:pPr>
+      <w:r>
+        <w:t>Die Originaldatei und die internen IDs im Viewer bleiben unverändert.</w:t>
+      </w:r>
+    </w:p>
+    <w:p>
+      <w:pPr>
+        <w:pStyle w:val="Heading3"/>
+      </w:pPr>
+      <w:r>
+        <w:t>24.09.2026</w:t>
+      </w:r>
+    </w:p>
+    <w:p>
+      <w:r>
+        <w:rPr>
+          <w:b/>
+        </w:rPr>
+        <w:t>Reihenfolge im Modellbaum</w:t>
+      </w:r>
+    </w:p>
+    <w:p>
+      <w:pPr>
+        <w:pStyle w:val="ListBullet"/>
+      </w:pPr>
+      <w:r>
+        <w:t xml:space="preserve">Die im Modellbaum eingestellte Reihenfolge (Drag-and-drop, </w:t>
+      </w:r>
+      <w:r>
+        <w:rPr>
+          <w:b/>
+        </w:rPr>
+        <w:t>Ganz nach oben</w:t>
+      </w:r>
+      <w:r>
+        <w:t xml:space="preserve">, </w:t>
+      </w:r>
+      <w:r>
+        <w:rPr>
+          <w:b/>
+        </w:rPr>
+        <w:t>Ganz nach unten</w:t>
+      </w:r>
+      <w:r>
+        <w:t>)</w:t>
+      </w:r>
+    </w:p>
+    <w:p>
+      <w:r>
+        <w:t xml:space="preserve">  wird jetzt dauerhaft gespeichert. Sie bleibt beim Neuaufbau des Baums erhalten – etwa beim Wechsel</w:t>
+      </w:r>
+    </w:p>
+    <w:p>
+      <w:r>
+        <w:t xml:space="preserve">  im Zeitstrahl, beim Löschen und Wiederherstellen von Bauteilen oder nach dem Neuladen der Seite.</w:t>
+      </w:r>
+    </w:p>
+    <w:p>
+      <w:pPr>
+        <w:pStyle w:val="ListBullet"/>
+      </w:pPr>
+      <w:r>
+        <w:t>Beide Exporte übernehmen diese Reihenfolge. Zuvor wurde sie im Inkrementexport gar nicht</w:t>
+      </w:r>
+    </w:p>
+    <w:p>
+      <w:r>
+        <w:t xml:space="preserve">  ausgewertet.</w:t>
+      </w:r>
+    </w:p>
+    <w:p>
+      <w:pPr>
+        <w:pStyle w:val="ListBullet"/>
+      </w:pPr>
+      <w:r>
+        <w:t>Beim Sortieren gehen keine Instanzen mehr verloren, die gerade nicht im Modellbaum stehen.</w:t>
+      </w:r>
+    </w:p>
+    <w:p>
+      <w:pPr>
+        <w:pStyle w:val="ListBullet"/>
+      </w:pPr>
+      <w:r>
+        <w:t>Zusätzlich werden jetzt auch die Bauteil-Definitionen in der exportierten Datei in die</w:t>
+      </w:r>
+    </w:p>
+    <w:p>
+      <w:r>
+        <w:t xml:space="preserve">  Baumreihenfolge gebracht. Bisher wurden nur die Komponenteneinträge selbst sortiert, sodass die</w:t>
+      </w:r>
+    </w:p>
+    <w:p>
+      <w:r>
+        <w:t xml:space="preserve">  Reihenfolge in Creo unter Umständen nicht ankam.</w:t>
+      </w:r>
+    </w:p>
+    <w:p>
+      <w:pPr>
+        <w:pStyle w:val="ListBullet"/>
+      </w:pPr>
+      <w:r>
+        <w:t>Siehe Abschnitt 7.4.</w:t>
+      </w:r>
+    </w:p>
+    <w:p>
+      <w:r>
+        <w:rPr>
+          <w:b/>
+        </w:rPr>
+        <w:t>Neue Option: IDs neu nummerieren (Reihenfolge für Creo)</w:t>
+      </w:r>
+    </w:p>
+    <w:p>
+      <w:pPr>
+        <w:pStyle w:val="ListBullet"/>
+      </w:pPr>
+      <w:r>
+        <w:t>Kontrollkästchen in der Kopfzeile neben den Export-Schaltflächen, im Auslieferungszustand</w:t>
+      </w:r>
+    </w:p>
+    <w:p>
+      <w:r>
+        <w:t xml:space="preserve">  ausgeschaltet.</w:t>
+      </w:r>
+    </w:p>
+    <w:p>
+      <w:pPr>
+        <w:pStyle w:val="ListBullet"/>
+      </w:pPr>
+      <w:r>
+        <w:t>Eingeschaltet vergibt der Export fortlaufende Instanznummern gemäß Modellbaum. Seit 25.09.2026 werden</w:t>
+      </w:r>
+    </w:p>
+    <w:p>
+      <w:r>
+        <w:t xml:space="preserve">  zusätzlich Assembly-Item-IDs nummeriert, damit der beobachtete Creo-Import die</w:t>
+      </w:r>
+    </w:p>
+    <w:p>
+      <w:r>
+        <w:t xml:space="preserve">  Komponenten in der gewünschten Reihenfolge anzeigt.</w:t>
+      </w:r>
+    </w:p>
+    <w:p>
+      <w:pPr>
+        <w:pStyle w:val="ListBullet"/>
+      </w:pPr>
+      <w:r>
+        <w:t>Das Inkrement nummeriert nie eigenständig um, sondern übernimmt die Nummerierung des letzten</w:t>
+      </w:r>
+    </w:p>
+    <w:p>
+      <w:r>
+        <w:t xml:space="preserve">  Baseline-Exports derselben Sitzung.</w:t>
+      </w:r>
+    </w:p>
+    <w:p>
+      <w:pPr>
+        <w:pStyle w:val="ListBullet"/>
+      </w:pPr>
+      <w:r>
+        <w:t>Siehe Abschnitte 15.1 und 15.2.</w:t>
+      </w:r>
+    </w:p>
+    <w:p>
+      <w:r>
+        <w:rPr>
+          <w:b/>
+        </w:rPr>
+        <w:t>Neue Option: MCAD-Namen beim Export ins File schreiben</w:t>
+      </w:r>
+    </w:p>
+    <w:p>
+      <w:pPr>
+        <w:pStyle w:val="ListBullet"/>
+      </w:pPr>
+      <w:r>
+        <w:t xml:space="preserve">Kontrollkästchen unter </w:t>
+      </w:r>
+      <w:r>
+        <w:rPr>
+          <w:b/>
+        </w:rPr>
+        <w:t>MCAD Namen verwenden</w:t>
+      </w:r>
+      <w:r>
+        <w:t>, nur auswählbar, solange diese Option aktiv ist.</w:t>
+      </w:r>
+    </w:p>
+    <w:p>
+      <w:pPr>
+        <w:pStyle w:val="ListBullet"/>
+      </w:pPr>
+      <w:r>
+        <w:t>Eingeschaltet werden die über die Hintmap zugeordneten Namen und Materialnummern in die</w:t>
+      </w:r>
+    </w:p>
+    <w:p>
+      <w:r>
+        <w:t xml:space="preserve">  exportierte Datei geschrieben, nicht nur angezeigt.</w:t>
+      </w:r>
+    </w:p>
+    <w:p>
+      <w:pPr>
+        <w:pStyle w:val="ListBullet"/>
+      </w:pPr>
+      <w:r>
+        <w:t>Löschmeldungen behalten weiterhin den ECAD-Originalnamen.</w:t>
+      </w:r>
+    </w:p>
+    <w:p>
+      <w:pPr>
+        <w:pStyle w:val="ListBullet"/>
+      </w:pPr>
+      <w:r>
+        <w:t>Siehe Abschnitt 13.</w:t>
+      </w:r>
+    </w:p>
+    <w:p>
+      <w:r>
+        <w:rPr>
+          <w:b/>
+        </w:rPr>
+        <w:t>Prüfung vor dem Laden</w:t>
+      </w:r>
+    </w:p>
+    <w:p>
+      <w:pPr>
+        <w:pStyle w:val="ListBullet"/>
+      </w:pPr>
+      <w:r>
+        <w:t>IDX-Dateien werden geprüft, bevor sie übernommen werden. Bei einem Fehler bleibt der bisherige</w:t>
+      </w:r>
+    </w:p>
+    <w:p>
+      <w:r>
+        <w:t xml:space="preserve">  Arbeitsstand unverändert.</w:t>
+      </w:r>
+    </w:p>
+    <w:p>
+      <w:pPr>
+        <w:pStyle w:val="ListBullet"/>
+      </w:pPr>
+      <w:r>
+        <w:t>Siehe Abschnitt 5.</w:t>
+      </w:r>
+    </w:p>
+    <w:p>
+      <w:r>
+        <w:rPr>
+          <w:b/>
+        </w:rPr>
+        <w:t>Inkremente werden angehängt</w:t>
+      </w:r>
+    </w:p>
+    <w:p>
+      <w:pPr>
+        <w:pStyle w:val="ListBullet"/>
+      </w:pPr>
+      <w:r>
+        <w:t>Zusätzlich geladene Inkremente ergänzen den Zeitstrahl, statt ihn zu ersetzen.</w:t>
+      </w:r>
+    </w:p>
+    <w:p>
+      <w:pPr>
+        <w:pStyle w:val="ListBullet"/>
+      </w:pPr>
+      <w:r>
+        <w:t>Eine bereits geladene Datei wird nicht erneut übernommen.</w:t>
+      </w:r>
+    </w:p>
+    <w:p>
+      <w:pPr>
+        <w:pStyle w:val="ListBullet"/>
+      </w:pPr>
+      <w:r>
+        <w:t>Siehe Abschnitt 9.1.</w:t>
+      </w:r>
+    </w:p>
+    <w:p>
+      <w:r>
+        <w:rPr>
+          <w:b/>
+        </w:rPr>
+        <w:t>Korrekturen</w:t>
+      </w:r>
+    </w:p>
+    <w:p>
+      <w:pPr>
+        <w:pStyle w:val="ListBullet"/>
+      </w:pPr>
+      <w:r>
+        <w:t>Gelöschte Bauteile erzeugen keine Aussparungen mehr in der Leiterplatte.</w:t>
+      </w:r>
+    </w:p>
+    <w:p>
+      <w:pPr>
+        <w:pStyle w:val="ListBullet"/>
+      </w:pPr>
+      <w:r>
+        <w:t>Das Laden einer neuen Baseline setzt Baumreihenfolge, manuelle Änderungen und eine zuvor vergebene</w:t>
+      </w:r>
+    </w:p>
+    <w:p>
+      <w:r>
+        <w:t xml:space="preserve">  Nummerierung zuverlässig zurück.</w:t>
       </w:r>
     </w:p>
     <w:p>

</xml_diff>

<commit_message>
feat: Verbessere Response-Dateinamen, Drag-and-Drop, #hilfe-Hash und bereinige Altdateien
</commit_message>
<xml_diff>
--- a/docs/Anwenderdokumentation.docx
+++ b/docs/Anwenderdokumentation.docx
@@ -28,7 +28,7 @@
         <w:t>Dokumentstand:</w:t>
       </w:r>
       <w:r>
-        <w:t xml:space="preserve"> 1. Oktober 2026</w:t>
+        <w:t xml:space="preserve"> 28. Oktober 2026</w:t>
       </w:r>
     </w:p>
     <w:p>
@@ -2025,7 +2025,29 @@
         <w:t>Datei auswählen</w:t>
       </w:r>
       <w:r>
-        <w:t>.</w:t>
+        <w:t xml:space="preserve"> (oder ziehen Sie die </w:t>
+      </w:r>
+      <w:r>
+        <w:rPr>
+          <w:rFonts w:ascii="Consolas" w:hAnsi="Consolas"/>
+          <w:color w:val="5C3815"/>
+          <w:sz w:val="19"/>
+        </w:rPr>
+        <w:t>.idx</w:t>
+      </w:r>
+      <w:r>
+        <w:t xml:space="preserve">- bzw. </w:t>
+      </w:r>
+      <w:r>
+        <w:rPr>
+          <w:rFonts w:ascii="Consolas" w:hAnsi="Consolas"/>
+          <w:color w:val="5C3815"/>
+          <w:sz w:val="19"/>
+        </w:rPr>
+        <w:t>.xml</w:t>
+      </w:r>
+      <w:r>
+        <w:t>-Datei per Drag-and-drop direkt in das Browserfenster).</w:t>
       </w:r>
     </w:p>
     <w:p>
@@ -4546,12 +4568,12 @@
         <w:t>Response exportieren</w:t>
       </w:r>
       <w:r>
-        <w:t xml:space="preserve"> können gespeicherte Ablehnungen ausgegeben werden.</w:t>
-      </w:r>
-    </w:p>
-    <w:p>
-      <w:r>
-        <w:t>Der aktuelle Download trägt weiterhin einen Namen mit:</w:t>
+        <w:t xml:space="preserve"> können gespeicherte Ablehnungen und Gegenvorschläge ausgegeben werden.</w:t>
+      </w:r>
+    </w:p>
+    <w:p>
+      <w:r>
+        <w:t>Der Download trägt den Dateinamen mit der Endung:</w:t>
       </w:r>
     </w:p>
     <w:p>
@@ -4565,12 +4587,7 @@
           <w:rFonts w:ascii="Consolas" w:hAnsi="Consolas"/>
           <w:sz w:val="18"/>
         </w:rPr>
-        <w:t>_increment.idx</w:t>
-      </w:r>
-    </w:p>
-    <w:p>
-      <w:r>
-        <w:t>Das ist auch dann möglich, wenn Sie den Response-Button verwendet haben. Entscheidend ist der Dateiinhalt.</w:t>
+        <w:t>_response.idx</w:t>
       </w:r>
     </w:p>
     <w:p>
@@ -6707,7 +6724,7 @@
     </w:p>
     <w:p>
       <w:r>
-        <w:t xml:space="preserve">Der Response-Export verwendet technisch denselben Downloadweg wie der Inkrementexport. Deshalb endet auch eine Response-Datei derzeit auf </w:t>
+        <w:t xml:space="preserve">Der Response-Export gibt gespeicherte Ablehnungen sowie etwaige eigene Gegenvorschläge aus und speichert die Datei unter dem Suffix </w:t>
       </w:r>
       <w:r>
         <w:rPr>
@@ -6715,10 +6732,21 @@
           <w:color w:val="5C3815"/>
           <w:sz w:val="19"/>
         </w:rPr>
-        <w:t>_increment.idx</w:t>
-      </w:r>
-      <w:r>
-        <w:t>.</w:t>
+        <w:t>_response.idx</w:t>
+      </w:r>
+      <w:r>
+        <w:t xml:space="preserve"> (bzw. </w:t>
+      </w:r>
+      <w:r>
+        <w:rPr>
+          <w:rFonts w:ascii="Consolas" w:hAnsi="Consolas"/>
+          <w:color w:val="5C3815"/>
+          <w:sz w:val="19"/>
+        </w:rPr>
+        <w:t>_response.xml</w:t>
+      </w:r>
+      <w:r>
+        <w:t>).</w:t>
       </w:r>
     </w:p>
     <w:p>
@@ -9635,12 +9663,71 @@
         <w:pStyle w:val="Heading3"/>
       </w:pPr>
       <w:r>
-        <w:t>Response heißt _increment.idx</w:t>
-      </w:r>
-    </w:p>
-    <w:p>
-      <w:r>
-        <w:t>Das ist der aktuell verwendete Dateiname. Prüfen Sie den Inhalt und die Vorgaben Ihres Übergabeprozesses.</w:t>
+        <w:t>Unterschied zwischen _increment.idx und _response.idx</w:t>
+      </w:r>
+    </w:p>
+    <w:p>
+      <w:r>
+        <w:rPr>
+          <w:b/>
+        </w:rPr>
+        <w:t>Inkrement</w:t>
+      </w:r>
+      <w:r>
+        <w:t xml:space="preserve"> exportiert unter </w:t>
+      </w:r>
+      <w:r>
+        <w:rPr>
+          <w:rFonts w:ascii="Consolas" w:hAnsi="Consolas"/>
+          <w:color w:val="5C3815"/>
+          <w:sz w:val="19"/>
+        </w:rPr>
+        <w:t>_increment.idx</w:t>
+      </w:r>
+      <w:r>
+        <w:t xml:space="preserve">, während </w:t>
+      </w:r>
+      <w:r>
+        <w:rPr>
+          <w:b/>
+        </w:rPr>
+        <w:t>Response exportieren</w:t>
+      </w:r>
+      <w:r>
+        <w:t xml:space="preserve"> unter </w:t>
+      </w:r>
+      <w:r>
+        <w:rPr>
+          <w:rFonts w:ascii="Consolas" w:hAnsi="Consolas"/>
+          <w:color w:val="5C3815"/>
+          <w:sz w:val="19"/>
+        </w:rPr>
+        <w:t>_response.idx</w:t>
+      </w:r>
+      <w:r>
+        <w:t xml:space="preserve"> speichert. Beide Dateien nutzen technisch das IDX-Änderungsformat (</w:t>
+      </w:r>
+      <w:r>
+        <w:rPr>
+          <w:rFonts w:ascii="Consolas" w:hAnsi="Consolas"/>
+          <w:color w:val="5C3815"/>
+          <w:sz w:val="19"/>
+        </w:rPr>
+        <w:t>EDMDProcessInstructionSendChanges</w:t>
+      </w:r>
+      <w:r>
+        <w:t>) und enthalten sowohl etwaige Ablehnungen (</w:t>
+      </w:r>
+      <w:r>
+        <w:rPr>
+          <w:rFonts w:ascii="Consolas" w:hAnsi="Consolas"/>
+          <w:color w:val="5C3815"/>
+          <w:sz w:val="19"/>
+        </w:rPr>
+        <w:t>EDMDResponse</w:t>
+      </w:r>
+      <w:r>
+        <w:t>) als auch manuelle Änderungen.</w:t>
       </w:r>
     </w:p>
     <w:p>
@@ -10077,6 +10164,148 @@
       </w:pPr>
       <w:r>
         <w:t>21. Änderungen / Versionshinweise</w:t>
+      </w:r>
+    </w:p>
+    <w:p>
+      <w:pPr>
+        <w:pStyle w:val="Heading3"/>
+      </w:pPr>
+      <w:r>
+        <w:t>28.10.2026</w:t>
+      </w:r>
+    </w:p>
+    <w:p>
+      <w:pPr>
+        <w:pStyle w:val="ListBullet"/>
+      </w:pPr>
+      <w:r>
+        <w:rPr>
+          <w:b/>
+        </w:rPr>
+        <w:t>Response-Dateiname (`_response.idx`):</w:t>
+      </w:r>
+      <w:r>
+        <w:t xml:space="preserve"> Der Export über </w:t>
+      </w:r>
+      <w:r>
+        <w:rPr>
+          <w:b/>
+        </w:rPr>
+        <w:t>Response exportieren</w:t>
+      </w:r>
+      <w:r>
+        <w:t xml:space="preserve"> vergibt nun den Dateinamen </w:t>
+      </w:r>
+      <w:r>
+        <w:rPr>
+          <w:rFonts w:ascii="Consolas" w:hAnsi="Consolas"/>
+          <w:color w:val="5C3815"/>
+          <w:sz w:val="19"/>
+        </w:rPr>
+        <w:t>_response.idx</w:t>
+      </w:r>
+      <w:r>
+        <w:t xml:space="preserve"> (statt </w:t>
+      </w:r>
+      <w:r>
+        <w:rPr>
+          <w:rFonts w:ascii="Consolas" w:hAnsi="Consolas"/>
+          <w:color w:val="5C3815"/>
+          <w:sz w:val="19"/>
+        </w:rPr>
+        <w:t>_increment.idx</w:t>
+      </w:r>
+      <w:r>
+        <w:t>).</w:t>
+      </w:r>
+    </w:p>
+    <w:p>
+      <w:pPr>
+        <w:pStyle w:val="ListBullet"/>
+      </w:pPr>
+      <w:r>
+        <w:rPr>
+          <w:b/>
+        </w:rPr>
+        <w:t>Drag-and-drop für IDX-Dateien:</w:t>
+      </w:r>
+      <w:r>
+        <w:t xml:space="preserve"> Baseline- und Inkrementdateien (</w:t>
+      </w:r>
+      <w:r>
+        <w:rPr>
+          <w:rFonts w:ascii="Consolas" w:hAnsi="Consolas"/>
+          <w:color w:val="5C3815"/>
+          <w:sz w:val="19"/>
+        </w:rPr>
+        <w:t>.idx</w:t>
+      </w:r>
+      <w:r>
+        <w:t xml:space="preserve"> / </w:t>
+      </w:r>
+      <w:r>
+        <w:rPr>
+          <w:rFonts w:ascii="Consolas" w:hAnsi="Consolas"/>
+          <w:color w:val="5C3815"/>
+          <w:sz w:val="19"/>
+        </w:rPr>
+        <w:t>.xml</w:t>
+      </w:r>
+      <w:r>
+        <w:t>) können direkt per Drag-and-drop in das Browserfenster gezogen werden.</w:t>
+      </w:r>
+    </w:p>
+    <w:p>
+      <w:pPr>
+        <w:pStyle w:val="ListBullet"/>
+      </w:pPr>
+      <w:r>
+        <w:rPr>
+          <w:b/>
+        </w:rPr>
+        <w:t>Direktlink `#hilfe` wiederhergestellt:</w:t>
+      </w:r>
+      <w:r>
+        <w:t xml:space="preserve"> Beim Aufruf der URL mit </w:t>
+      </w:r>
+      <w:r>
+        <w:rPr>
+          <w:rFonts w:ascii="Consolas" w:hAnsi="Consolas"/>
+          <w:color w:val="5C3815"/>
+          <w:sz w:val="19"/>
+        </w:rPr>
+        <w:t>#hilfe</w:t>
+      </w:r>
+      <w:r>
+        <w:t xml:space="preserve"> öffnet sich das integrierte Hilfefenster wieder automatisch.</w:t>
+      </w:r>
+    </w:p>
+    <w:p>
+      <w:pPr>
+        <w:pStyle w:val="ListBullet"/>
+      </w:pPr>
+      <w:r>
+        <w:rPr>
+          <w:b/>
+        </w:rPr>
+        <w:t>Link zu `haenggi-vip`:</w:t>
+      </w:r>
+      <w:r>
+        <w:t xml:space="preserve"> Direktlink zum GitHub-Repository in der Kopfzeile des Viewers und im Hilfefenster ergänzt.</w:t>
+      </w:r>
+    </w:p>
+    <w:p>
+      <w:pPr>
+        <w:pStyle w:val="ListBullet"/>
+      </w:pPr>
+      <w:r>
+        <w:rPr>
+          <w:b/>
+        </w:rPr>
+        <w:t>Bereinigung &amp; CI/CD:</w:t>
+      </w:r>
+      <w:r>
+        <w:t xml:space="preserve"> Veraltete Skript- und DOCX-Duplikate entfernt; automatisierte Ausführung der JSDOM-Tests und schlankes Artefakt-Packaging in der GitHub-Pages-Pipeline ergänzt.</w:t>
       </w:r>
     </w:p>
     <w:p>

</xml_diff>

<commit_message>
docs: Korrigiere Versionshinweis, Links auf Benutzerdokumentation und veralteten Testkommentar
</commit_message>
<xml_diff>
--- a/docs/Anwenderdokumentation.docx
+++ b/docs/Anwenderdokumentation.docx
@@ -10302,10 +10302,32 @@
         <w:rPr>
           <w:b/>
         </w:rPr>
-        <w:t>Bereinigung &amp; CI/CD:</w:t>
-      </w:r>
-      <w:r>
-        <w:t xml:space="preserve"> Veraltete Skript- und DOCX-Duplikate entfernt; automatisierte Ausführung der JSDOM-Tests und schlankes Artefakt-Packaging in der GitHub-Pages-Pipeline ergänzt.</w:t>
+        <w:t>Bereinigung:</w:t>
+      </w:r>
+      <w:r>
+        <w:t xml:space="preserve"> Veraltete Skript- und DOCX-Duplikate (</w:t>
+      </w:r>
+      <w:r>
+        <w:rPr>
+          <w:rFonts w:ascii="Consolas" w:hAnsi="Consolas"/>
+          <w:color w:val="5C3815"/>
+          <w:sz w:val="19"/>
+        </w:rPr>
+        <w:t>main_script_fixed.js</w:t>
+      </w:r>
+      <w:r>
+        <w:t xml:space="preserve">, </w:t>
+      </w:r>
+      <w:r>
+        <w:rPr>
+          <w:rFonts w:ascii="Consolas" w:hAnsi="Consolas"/>
+          <w:color w:val="5C3815"/>
+          <w:sz w:val="19"/>
+        </w:rPr>
+        <w:t>Benutzerdokumentation*.docx</w:t>
+      </w:r>
+      <w:r>
+        <w:t>) entfernt.</w:t>
       </w:r>
     </w:p>
     <w:p>

</xml_diff>

<commit_message>
feat: Aktualisiere Link auf Webseite https://haenggi.vip
</commit_message>
<xml_diff>
--- a/docs/Anwenderdokumentation.docx
+++ b/docs/Anwenderdokumentation.docx
@@ -10288,10 +10288,21 @@
         <w:rPr>
           <w:b/>
         </w:rPr>
-        <w:t>Link zu `haenggi-vip`:</w:t>
-      </w:r>
-      <w:r>
-        <w:t xml:space="preserve"> Direktlink zum GitHub-Repository in der Kopfzeile des Viewers und im Hilfefenster ergänzt.</w:t>
+        <w:t>Link zu `haenggi.vip`:</w:t>
+      </w:r>
+      <w:r>
+        <w:t xml:space="preserve"> Direktlink zur Webseite </w:t>
+      </w:r>
+      <w:r>
+        <w:rPr>
+          <w:rFonts w:ascii="Consolas" w:hAnsi="Consolas"/>
+          <w:color w:val="5C3815"/>
+          <w:sz w:val="19"/>
+        </w:rPr>
+        <w:t>haenggi.vip</w:t>
+      </w:r>
+      <w:r>
+        <w:t xml:space="preserve"> in der Kopfzeile des Viewers und im Hilfefenster ergänzt.</w:t>
       </w:r>
     </w:p>
     <w:p>

</xml_diff>